<commit_message>
Comparer les corridors Lomé et Cotonou et actualiser les taux
- nouvel onglet Corridors : quatre scénarios d'acheminement (Lomé prudent ou
  optimiste, Cotonou via le Nigeria, Cotonou frontière rouverte) pilotés par
  un sélecteur unique dans les hypothèses
- signale la fermeture de la frontière Bénin-Niger depuis juillet 2023, non
  levée en août 2026, et la réouverture du corridor Tsamiya-Kamba par le
  Nigeria le 9 février 2026
- PCS ramené à 0,8 % (taux appliqué au Niger) : droits à 7,3 % au lieu de 7,5 %
- prix de vente et tarif commercial recalculés
- note de calcul : tableau du niveau de fiabilité de chaque donnée, distinguant
  les chiffres fermes des fourchettes de marché et de ce qui reste à confirmer

Co-Authored-By: Claude Opus 5 <noreply@anthropic.com>
Claude-Session: https://claude.ai/code/session_017KgrzJui3uU4u3uue6UcyC
</commit_message>
<xml_diff>
--- a/COMMERCIAL/2026-IMPORT-MACHINES-AGRICOLES-ZENO/docx/NOTE_DE_CALCUL.docx
+++ b/COMMERCIAL/2026-IMPORT-MACHINES-AGRICOLES-ZENO/docx/NOTE_DE_CALCUL.docx
@@ -571,7 +571,575 @@
       </w:pPr>
       <w:r/>
       <w:r>
-        <w:t>2. COÛTS D'APPROCHE JUSQU'À NIAMEY</w:t>
+        <w:t>2. CHOIX DU CORRIDOR — LOMÉ OU COTONOU ?</w:t>
+      </w:r>
+    </w:p>
+    <w:p>
+      <w:pPr>
+        <w:pStyle w:val="IntenseQuote"/>
+      </w:pPr>
+      <w:r>
+        <w:t>⚠️ **SITUATION AU 19 AOÛT 2026 : la frontière terrestre Bénin–Niger (Malanville–Gaya) est</w:t>
+      </w:r>
+    </w:p>
+    <w:p>
+      <w:pPr>
+        <w:pStyle w:val="IntenseQuote"/>
+      </w:pPr>
+      <w:r>
+        <w:t>FERMÉE depuis juillet 2023 et n'est toujours pas rouverte.** Un accord de principe a été</w:t>
+      </w:r>
+    </w:p>
+    <w:p>
+      <w:pPr>
+        <w:pStyle w:val="IntenseQuote"/>
+      </w:pPr>
+      <w:r>
+        <w:t>acté à Niamey le 2 juin 2026 et un comité d'experts installé, mais la réouverture n'est pas</w:t>
+      </w:r>
+    </w:p>
+    <w:p>
+      <w:pPr>
+        <w:pStyle w:val="IntenseQuote"/>
+      </w:pPr>
+      <w:r>
+        <w:t xml:space="preserve">effective. Le corridor </w:t>
+      </w:r>
+      <w:r>
+        <w:rPr>
+          <w:b/>
+        </w:rPr>
+        <w:t>Tsamiya–Kamba, par le Nigeria, a été rouvert le 9 février 2026</w:t>
+      </w:r>
+      <w:r>
+        <w:t xml:space="preserve"> :</w:t>
+      </w:r>
+    </w:p>
+    <w:p>
+      <w:pPr>
+        <w:pStyle w:val="IntenseQuote"/>
+      </w:pPr>
+      <w:r>
+        <w:t>il permet d'acheminer par Cotonou, au prix d'un détour d'environ 600 km.</w:t>
+      </w:r>
+    </w:p>
+    <w:tbl>
+      <w:tblPr>
+        <w:tblStyle w:val="TableGrid"/>
+        <w:tblW w:type="auto" w:w="0"/>
+        <w:tblLook w:firstColumn="1" w:firstRow="1" w:lastColumn="0" w:lastRow="0" w:noHBand="0" w:noVBand="1" w:val="04A0"/>
+      </w:tblPr>
+      <w:tblGrid>
+        <w:gridCol w:w="1392"/>
+        <w:gridCol w:w="1392"/>
+        <w:gridCol w:w="1392"/>
+        <w:gridCol w:w="1392"/>
+        <w:gridCol w:w="1392"/>
+        <w:gridCol w:w="1392"/>
+        <w:gridCol w:w="1392"/>
+      </w:tblGrid>
+      <w:tr>
+        <w:tc>
+          <w:tcPr>
+            <w:tcW w:type="dxa" w:w="1392"/>
+          </w:tcPr>
+          <w:p>
+            <w:r>
+              <w:rPr>
+                <w:b/>
+              </w:rPr>
+            </w:r>
+            <w:r>
+              <w:rPr>
+                <w:b/>
+              </w:rPr>
+              <w:t>Scénario</w:t>
+            </w:r>
+          </w:p>
+        </w:tc>
+        <w:tc>
+          <w:tcPr>
+            <w:tcW w:type="dxa" w:w="1392"/>
+          </w:tcPr>
+          <w:p>
+            <w:r>
+              <w:rPr>
+                <w:b/>
+              </w:rPr>
+            </w:r>
+            <w:r>
+              <w:rPr>
+                <w:b/>
+              </w:rPr>
+              <w:t>Fret 20'</w:t>
+            </w:r>
+          </w:p>
+        </w:tc>
+        <w:tc>
+          <w:tcPr>
+            <w:tcW w:type="dxa" w:w="1392"/>
+          </w:tcPr>
+          <w:p>
+            <w:r>
+              <w:rPr>
+                <w:b/>
+              </w:rPr>
+            </w:r>
+            <w:r>
+              <w:rPr>
+                <w:b/>
+              </w:rPr>
+              <w:t>Port</w:t>
+            </w:r>
+          </w:p>
+        </w:tc>
+        <w:tc>
+          <w:tcPr>
+            <w:tcW w:type="dxa" w:w="1392"/>
+          </w:tcPr>
+          <w:p>
+            <w:r>
+              <w:rPr>
+                <w:b/>
+              </w:rPr>
+            </w:r>
+            <w:r>
+              <w:rPr>
+                <w:b/>
+              </w:rPr>
+              <w:t>Route → Niamey</w:t>
+            </w:r>
+          </w:p>
+        </w:tc>
+        <w:tc>
+          <w:tcPr>
+            <w:tcW w:type="dxa" w:w="1392"/>
+          </w:tcPr>
+          <w:p>
+            <w:r>
+              <w:rPr>
+                <w:b/>
+              </w:rPr>
+            </w:r>
+            <w:r>
+              <w:rPr>
+                <w:b/>
+              </w:rPr>
+              <w:t>Transit Niamey</w:t>
+            </w:r>
+          </w:p>
+        </w:tc>
+        <w:tc>
+          <w:tcPr>
+            <w:tcW w:type="dxa" w:w="1392"/>
+          </w:tcPr>
+          <w:p>
+            <w:r>
+              <w:rPr>
+                <w:b/>
+              </w:rPr>
+            </w:r>
+            <w:r>
+              <w:rPr>
+                <w:b/>
+              </w:rPr>
+              <w:t>Prix de revient total</w:t>
+            </w:r>
+          </w:p>
+        </w:tc>
+        <w:tc>
+          <w:tcPr>
+            <w:tcW w:type="dxa" w:w="1392"/>
+          </w:tcPr>
+          <w:p>
+            <w:r>
+              <w:rPr>
+                <w:b/>
+              </w:rPr>
+            </w:r>
+            <w:r>
+              <w:rPr>
+                <w:b/>
+              </w:rPr>
+              <w:t>Délai</w:t>
+            </w:r>
+          </w:p>
+        </w:tc>
+      </w:tr>
+      <w:tr>
+        <w:tc>
+          <w:tcPr>
+            <w:tcW w:type="dxa" w:w="1392"/>
+          </w:tcPr>
+          <w:p>
+            <w:r/>
+            <w:r>
+              <w:rPr>
+                <w:b/>
+              </w:rPr>
+              <w:t>1. Lomé — prudent (retenu)</w:t>
+            </w:r>
+          </w:p>
+        </w:tc>
+        <w:tc>
+          <w:tcPr>
+            <w:tcW w:type="dxa" w:w="1392"/>
+          </w:tcPr>
+          <w:p>
+            <w:r/>
+            <w:r>
+              <w:t>1 900 USD</w:t>
+            </w:r>
+          </w:p>
+        </w:tc>
+        <w:tc>
+          <w:tcPr>
+            <w:tcW w:type="dxa" w:w="1392"/>
+          </w:tcPr>
+          <w:p>
+            <w:r/>
+            <w:r>
+              <w:t>450 000 F</w:t>
+            </w:r>
+          </w:p>
+        </w:tc>
+        <w:tc>
+          <w:tcPr>
+            <w:tcW w:type="dxa" w:w="1392"/>
+          </w:tcPr>
+          <w:p>
+            <w:r/>
+            <w:r>
+              <w:t>1 600 000 F</w:t>
+            </w:r>
+          </w:p>
+        </w:tc>
+        <w:tc>
+          <w:tcPr>
+            <w:tcW w:type="dxa" w:w="1392"/>
+          </w:tcPr>
+          <w:p>
+            <w:r/>
+            <w:r>
+              <w:t>350 000 F</w:t>
+            </w:r>
+          </w:p>
+        </w:tc>
+        <w:tc>
+          <w:tcPr>
+            <w:tcW w:type="dxa" w:w="1392"/>
+          </w:tcPr>
+          <w:p>
+            <w:r/>
+            <w:r>
+              <w:rPr>
+                <w:b/>
+              </w:rPr>
+              <w:t>17 422 342 F</w:t>
+            </w:r>
+          </w:p>
+        </w:tc>
+        <w:tc>
+          <w:tcPr>
+            <w:tcW w:type="dxa" w:w="1392"/>
+          </w:tcPr>
+          <w:p>
+            <w:r/>
+            <w:r>
+              <w:t>90 j</w:t>
+            </w:r>
+          </w:p>
+        </w:tc>
+      </w:tr>
+      <w:tr>
+        <w:tc>
+          <w:tcPr>
+            <w:tcW w:type="dxa" w:w="1392"/>
+          </w:tcPr>
+          <w:p>
+            <w:r/>
+            <w:r>
+              <w:t>2. Lomé — optimiste</w:t>
+            </w:r>
+          </w:p>
+        </w:tc>
+        <w:tc>
+          <w:tcPr>
+            <w:tcW w:type="dxa" w:w="1392"/>
+          </w:tcPr>
+          <w:p>
+            <w:r/>
+            <w:r>
+              <w:t>1 500 USD</w:t>
+            </w:r>
+          </w:p>
+        </w:tc>
+        <w:tc>
+          <w:tcPr>
+            <w:tcW w:type="dxa" w:w="1392"/>
+          </w:tcPr>
+          <w:p>
+            <w:r/>
+            <w:r>
+              <w:t>350 000 F</w:t>
+            </w:r>
+          </w:p>
+        </w:tc>
+        <w:tc>
+          <w:tcPr>
+            <w:tcW w:type="dxa" w:w="1392"/>
+          </w:tcPr>
+          <w:p>
+            <w:r/>
+            <w:r>
+              <w:t>1 300 000 F</w:t>
+            </w:r>
+          </w:p>
+        </w:tc>
+        <w:tc>
+          <w:tcPr>
+            <w:tcW w:type="dxa" w:w="1392"/>
+          </w:tcPr>
+          <w:p>
+            <w:r/>
+            <w:r>
+              <w:t>250 000 F</w:t>
+            </w:r>
+          </w:p>
+        </w:tc>
+        <w:tc>
+          <w:tcPr>
+            <w:tcW w:type="dxa" w:w="1392"/>
+          </w:tcPr>
+          <w:p>
+            <w:r/>
+            <w:r>
+              <w:t>16 643 619 F</w:t>
+            </w:r>
+          </w:p>
+        </w:tc>
+        <w:tc>
+          <w:tcPr>
+            <w:tcW w:type="dxa" w:w="1392"/>
+          </w:tcPr>
+          <w:p>
+            <w:r/>
+            <w:r>
+              <w:t>75 j</w:t>
+            </w:r>
+          </w:p>
+        </w:tc>
+      </w:tr>
+      <w:tr>
+        <w:tc>
+          <w:tcPr>
+            <w:tcW w:type="dxa" w:w="1392"/>
+          </w:tcPr>
+          <w:p>
+            <w:r/>
+            <w:r>
+              <w:t>3. Cotonou via Nigeria</w:t>
+            </w:r>
+          </w:p>
+        </w:tc>
+        <w:tc>
+          <w:tcPr>
+            <w:tcW w:type="dxa" w:w="1392"/>
+          </w:tcPr>
+          <w:p>
+            <w:r/>
+            <w:r>
+              <w:t>1 700 USD</w:t>
+            </w:r>
+          </w:p>
+        </w:tc>
+        <w:tc>
+          <w:tcPr>
+            <w:tcW w:type="dxa" w:w="1392"/>
+          </w:tcPr>
+          <w:p>
+            <w:r/>
+            <w:r>
+              <w:t>500 000 F</w:t>
+            </w:r>
+          </w:p>
+        </w:tc>
+        <w:tc>
+          <w:tcPr>
+            <w:tcW w:type="dxa" w:w="1392"/>
+          </w:tcPr>
+          <w:p>
+            <w:r/>
+            <w:r>
+              <w:t>1 900 000 F</w:t>
+            </w:r>
+          </w:p>
+        </w:tc>
+        <w:tc>
+          <w:tcPr>
+            <w:tcW w:type="dxa" w:w="1392"/>
+          </w:tcPr>
+          <w:p>
+            <w:r/>
+            <w:r>
+              <w:t>400 000 F</w:t>
+            </w:r>
+          </w:p>
+        </w:tc>
+        <w:tc>
+          <w:tcPr>
+            <w:tcW w:type="dxa" w:w="1392"/>
+          </w:tcPr>
+          <w:p>
+            <w:r/>
+            <w:r>
+              <w:t>17 729 488 F</w:t>
+            </w:r>
+          </w:p>
+        </w:tc>
+        <w:tc>
+          <w:tcPr>
+            <w:tcW w:type="dxa" w:w="1392"/>
+          </w:tcPr>
+          <w:p>
+            <w:r/>
+            <w:r>
+              <w:t>100 j</w:t>
+            </w:r>
+          </w:p>
+        </w:tc>
+      </w:tr>
+      <w:tr>
+        <w:tc>
+          <w:tcPr>
+            <w:tcW w:type="dxa" w:w="1392"/>
+          </w:tcPr>
+          <w:p>
+            <w:r/>
+            <w:r>
+              <w:t>4. Cotonou frontière rouverte</w:t>
+            </w:r>
+          </w:p>
+        </w:tc>
+        <w:tc>
+          <w:tcPr>
+            <w:tcW w:type="dxa" w:w="1392"/>
+          </w:tcPr>
+          <w:p>
+            <w:r/>
+            <w:r>
+              <w:t>1 500 USD</w:t>
+            </w:r>
+          </w:p>
+        </w:tc>
+        <w:tc>
+          <w:tcPr>
+            <w:tcW w:type="dxa" w:w="1392"/>
+          </w:tcPr>
+          <w:p>
+            <w:r/>
+            <w:r>
+              <w:t>400 000 F</w:t>
+            </w:r>
+          </w:p>
+        </w:tc>
+        <w:tc>
+          <w:tcPr>
+            <w:tcW w:type="dxa" w:w="1392"/>
+          </w:tcPr>
+          <w:p>
+            <w:r/>
+            <w:r>
+              <w:t>1 200 000 F</w:t>
+            </w:r>
+          </w:p>
+        </w:tc>
+        <w:tc>
+          <w:tcPr>
+            <w:tcW w:type="dxa" w:w="1392"/>
+          </w:tcPr>
+          <w:p>
+            <w:r/>
+            <w:r>
+              <w:t>300 000 F</w:t>
+            </w:r>
+          </w:p>
+        </w:tc>
+        <w:tc>
+          <w:tcPr>
+            <w:tcW w:type="dxa" w:w="1392"/>
+          </w:tcPr>
+          <w:p>
+            <w:r/>
+            <w:r>
+              <w:t>16 636 173 F</w:t>
+            </w:r>
+          </w:p>
+        </w:tc>
+        <w:tc>
+          <w:tcPr>
+            <w:tcW w:type="dxa" w:w="1392"/>
+          </w:tcPr>
+          <w:p>
+            <w:r/>
+            <w:r>
+              <w:t>80 j</w:t>
+            </w:r>
+          </w:p>
+        </w:tc>
+      </w:tr>
+    </w:tbl>
+    <w:p/>
+    <w:p>
+      <w:r>
+        <w:rPr>
+          <w:b/>
+        </w:rPr>
+        <w:t>Écart maximal entre corridors : environ 1 100 000 FCFA sur le conteneur, soit 27 000 F par machine.</w:t>
+      </w:r>
+      <w:r>
+        <w:t xml:space="preserve"> Le corridor de Cotonou redevient le plus intéressant </w:t>
+      </w:r>
+      <w:r>
+        <w:rPr>
+          <w:b/>
+        </w:rPr>
+        <w:t>dès la réouverture de la frontière</w:t>
+      </w:r>
+      <w:r>
+        <w:t xml:space="preserve"> ; tant qu'elle est fermée, Lomé reste la voie la plus sûre et la moins chère.</w:t>
+      </w:r>
+    </w:p>
+    <w:p>
+      <w:r>
+        <w:t xml:space="preserve">Le corridor se change dans le classeur : onglet </w:t>
+      </w:r>
+      <w:r>
+        <w:rPr>
+          <w:b/>
+        </w:rPr>
+        <w:t>Hypothèses</w:t>
+      </w:r>
+      <w:r>
+        <w:t xml:space="preserve">, cellule </w:t>
+      </w:r>
+      <w:r>
+        <w:rPr>
+          <w:b/>
+        </w:rPr>
+        <w:t>B3</w:t>
+      </w:r>
+      <w:r>
+        <w:t xml:space="preserve"> (valeur 1 à 4). Tous les prix se recalculent automatiquement.</w:t>
+      </w:r>
+    </w:p>
+    <w:p>
+      <w:pPr>
+        <w:pStyle w:val="Heading2"/>
+      </w:pPr>
+      <w:r/>
+      <w:r>
+        <w:t>3. COÛTS D'APPROCHE JUSQU'À NIAMEY (corridor de Lomé retenu)</w:t>
       </w:r>
     </w:p>
     <w:tbl>
@@ -967,7 +1535,7 @@
       </w:pPr>
       <w:r/>
       <w:r>
-        <w:t>3. DROITS ET TAXES À L'IMPORT</w:t>
+        <w:t>4. DROITS ET TAXES À L'IMPORT</w:t>
       </w:r>
     </w:p>
     <w:p>
@@ -1181,7 +1749,7 @@
           <w:p>
             <w:r/>
             <w:r>
-              <w:t>1 %</w:t>
+              <w:t>0,8 %</w:t>
             </w:r>
           </w:p>
         </w:tc>
@@ -1192,7 +1760,7 @@
           <w:p>
             <w:r/>
             <w:r>
-              <w:t>147 076</w:t>
+              <w:t>117 661</w:t>
             </w:r>
           </w:p>
         </w:tc>
@@ -1285,7 +1853,7 @@
               <w:rPr>
                 <w:b/>
               </w:rPr>
-              <w:t>7,5 %</w:t>
+              <w:t>7,3 %</w:t>
             </w:r>
           </w:p>
         </w:tc>
@@ -1299,7 +1867,7 @@
               <w:rPr>
                 <w:b/>
               </w:rPr>
-              <w:t>1 103 071</w:t>
+              <w:t>1 073 656</w:t>
             </w:r>
           </w:p>
         </w:tc>
@@ -1442,7 +2010,7 @@
       </w:pPr>
       <w:r/>
       <w:r>
-        <w:t>4. PRIX DE REVIENT RENDU NIAMEY</w:t>
+        <w:t>5. PRIX DE REVIENT RENDU NIAMEY</w:t>
       </w:r>
     </w:p>
     <w:p>
@@ -1584,7 +2152,7 @@
           <w:p>
             <w:r/>
             <w:r>
-              <w:t>4 634 561</w:t>
+              <w:t>4 626 963</w:t>
             </w:r>
           </w:p>
         </w:tc>
@@ -1598,7 +2166,7 @@
               <w:rPr>
                 <w:b/>
               </w:rPr>
-              <w:t>463 456</w:t>
+              <w:t>462 696</w:t>
             </w:r>
           </w:p>
         </w:tc>
@@ -1633,7 +2201,7 @@
           <w:p>
             <w:r/>
             <w:r>
-              <w:t>1 038 592</w:t>
+              <w:t>1 036 909</w:t>
             </w:r>
           </w:p>
         </w:tc>
@@ -1647,7 +2215,7 @@
               <w:rPr>
                 <w:b/>
               </w:rPr>
-              <w:t>103 859</w:t>
+              <w:t>103 691</w:t>
             </w:r>
           </w:p>
         </w:tc>
@@ -1682,7 +2250,7 @@
           <w:p>
             <w:r/>
             <w:r>
-              <w:t>4 582 172</w:t>
+              <w:t>4 574 240</w:t>
             </w:r>
           </w:p>
         </w:tc>
@@ -1696,7 +2264,7 @@
               <w:rPr>
                 <w:b/>
               </w:rPr>
-              <w:t>458 217</w:t>
+              <w:t>457 424</w:t>
             </w:r>
           </w:p>
         </w:tc>
@@ -1731,7 +2299,7 @@
           <w:p>
             <w:r/>
             <w:r>
-              <w:t>7 197 021</w:t>
+              <w:t>7 184 230</w:t>
             </w:r>
           </w:p>
         </w:tc>
@@ -1745,7 +2313,7 @@
               <w:rPr>
                 <w:b/>
               </w:rPr>
-              <w:t>719 703</w:t>
+              <w:t>718 423</w:t>
             </w:r>
           </w:p>
         </w:tc>
@@ -1786,7 +2354,7 @@
               <w:rPr>
                 <w:b/>
               </w:rPr>
-              <w:t>17 452 346</w:t>
+              <w:t>17 422 342</w:t>
             </w:r>
           </w:p>
         </w:tc>
@@ -1820,13 +2388,13 @@
         <w:t>Trésorerie à mobiliser</w:t>
       </w:r>
       <w:r>
-        <w:t xml:space="preserve"> : 17 452 346 + 3 004 030 (TVA) + 316 214 (ISB) = </w:t>
+        <w:t xml:space="preserve"> : 17 422 342 + 2 998 441 (TVA) + 315 625 (ISB) = </w:t>
       </w:r>
       <w:r>
         <w:rPr>
           <w:b/>
         </w:rPr>
-        <w:t>20 772 590 FCFA</w:t>
+        <w:t>20 736 408 FCFA</w:t>
       </w:r>
       <w:r>
         <w:t>, dont environ 6 millions dès la commande (acompte de 50 %).</w:t>
@@ -1838,7 +2406,7 @@
       </w:pPr>
       <w:r/>
       <w:r>
-        <w:t>5. PRIX DE VENTE ESTIMATIFS SUR LE MARCHÉ NIGÉRIEN</w:t>
+        <w:t>6. PRIX DE VENTE ESTIMATIFS SUR LE MARCHÉ NIGÉRIEN</w:t>
       </w:r>
     </w:p>
     <w:tbl>
@@ -2022,7 +2590,7 @@
           <w:p>
             <w:r/>
             <w:r>
-              <w:t>463 456</w:t>
+              <w:t>462 696</w:t>
             </w:r>
           </w:p>
         </w:tc>
@@ -2036,7 +2604,7 @@
               <w:rPr>
                 <w:b/>
               </w:rPr>
-              <w:t>790 000</w:t>
+              <w:t>785 000</w:t>
             </w:r>
           </w:p>
         </w:tc>
@@ -2047,7 +2615,7 @@
           <w:p>
             <w:r/>
             <w:r>
-              <w:t>940 100</w:t>
+              <w:t>934 150</w:t>
             </w:r>
           </w:p>
         </w:tc>
@@ -2069,7 +2637,7 @@
           <w:p>
             <w:r/>
             <w:r>
-              <w:t>326 544</w:t>
+              <w:t>322 304</w:t>
             </w:r>
           </w:p>
         </w:tc>
@@ -2080,7 +2648,7 @@
           <w:p>
             <w:r/>
             <w:r>
-              <w:t>41,3 %</w:t>
+              <w:t>41,1 %</w:t>
             </w:r>
           </w:p>
         </w:tc>
@@ -2115,7 +2683,7 @@
           <w:p>
             <w:r/>
             <w:r>
-              <w:t>103 859</w:t>
+              <w:t>103 691</w:t>
             </w:r>
           </w:p>
         </w:tc>
@@ -2162,7 +2730,7 @@
           <w:p>
             <w:r/>
             <w:r>
-              <w:t>71 141</w:t>
+              <w:t>71 309</w:t>
             </w:r>
           </w:p>
         </w:tc>
@@ -2208,7 +2776,7 @@
           <w:p>
             <w:r/>
             <w:r>
-              <w:t>458 217</w:t>
+              <w:t>457 424</w:t>
             </w:r>
           </w:p>
         </w:tc>
@@ -2255,7 +2823,7 @@
           <w:p>
             <w:r/>
             <w:r>
-              <w:t>321 783</w:t>
+              <w:t>322 576</w:t>
             </w:r>
           </w:p>
         </w:tc>
@@ -2266,7 +2834,7 @@
           <w:p>
             <w:r/>
             <w:r>
-              <w:t>41,3 %</w:t>
+              <w:t>41,4 %</w:t>
             </w:r>
           </w:p>
         </w:tc>
@@ -2301,7 +2869,7 @@
           <w:p>
             <w:r/>
             <w:r>
-              <w:t>719 703</w:t>
+              <w:t>718 423</w:t>
             </w:r>
           </w:p>
         </w:tc>
@@ -2315,7 +2883,7 @@
               <w:rPr>
                 <w:b/>
               </w:rPr>
-              <w:t>1 225 000</w:t>
+              <w:t>1 220 000</w:t>
             </w:r>
           </w:p>
         </w:tc>
@@ -2326,7 +2894,7 @@
           <w:p>
             <w:r/>
             <w:r>
-              <w:t>1 457 750</w:t>
+              <w:t>1 451 800</w:t>
             </w:r>
           </w:p>
         </w:tc>
@@ -2337,7 +2905,7 @@
           <w:p>
             <w:r/>
             <w:r>
-              <w:t>1 045 000</w:t>
+              <w:t>1 040 000</w:t>
             </w:r>
           </w:p>
         </w:tc>
@@ -2348,7 +2916,7 @@
           <w:p>
             <w:r/>
             <w:r>
-              <w:t>505 297</w:t>
+              <w:t>501 577</w:t>
             </w:r>
           </w:p>
         </w:tc>
@@ -2359,7 +2927,7 @@
           <w:p>
             <w:r/>
             <w:r>
-              <w:t>41,2 %</w:t>
+              <w:t>41,1 %</w:t>
             </w:r>
           </w:p>
         </w:tc>
@@ -2476,7 +3044,7 @@
           <w:p>
             <w:r/>
             <w:r>
-              <w:t>17 452 346</w:t>
+              <w:t>17 422 342</w:t>
             </w:r>
           </w:p>
         </w:tc>
@@ -2500,7 +3068,7 @@
           <w:p>
             <w:r/>
             <w:r>
-              <w:t>25 300 000</w:t>
+              <w:t>25 250 000</w:t>
             </w:r>
           </w:p>
         </w:tc>
@@ -2530,7 +3098,7 @@
               <w:rPr>
                 <w:b/>
               </w:rPr>
-              <w:t>29 700 000</w:t>
+              <w:t>29 600 000</w:t>
             </w:r>
           </w:p>
         </w:tc>
@@ -2554,7 +3122,7 @@
           <w:p>
             <w:r/>
             <w:r>
-              <w:t>33 100 000</w:t>
+              <w:t>33 050 000</w:t>
             </w:r>
           </w:p>
         </w:tc>
@@ -2584,7 +3152,7 @@
               <w:rPr>
                 <w:b/>
               </w:rPr>
-              <w:t>12 247 654</w:t>
+              <w:t>12 177 658</w:t>
             </w:r>
           </w:p>
         </w:tc>
@@ -2608,7 +3176,7 @@
           <w:p>
             <w:r/>
             <w:r>
-              <w:t>41,2 %</w:t>
+              <w:t>41,1 %</w:t>
             </w:r>
           </w:p>
         </w:tc>
@@ -2632,7 +3200,7 @@
           <w:p>
             <w:r/>
             <w:r>
-              <w:t>70,2 %</w:t>
+              <w:t>69,9 %</w:t>
             </w:r>
           </w:p>
         </w:tc>
@@ -2645,7 +3213,7 @@
       </w:pPr>
       <w:r/>
       <w:r>
-        <w:t>6. DÉLAI PRÉVISIONNEL</w:t>
+        <w:t>7. DÉLAI PRÉVISIONNEL</w:t>
       </w:r>
     </w:p>
     <w:tbl>
@@ -2830,7 +3398,7 @@
       </w:pPr>
       <w:r/>
       <w:r>
-        <w:t>7. RECOMMANDATIONS</w:t>
+        <w:t>8. RECOMMANDATIONS</w:t>
       </w:r>
     </w:p>
     <w:p>
@@ -2949,6 +3517,25 @@
     </w:p>
     <w:p>
       <w:pPr>
+        <w:pStyle w:val="ListNumber"/>
+      </w:pPr>
+      <w:r>
+        <w:rPr>
+          <w:b/>
+        </w:rPr>
+        <w:t>Suivre la réouverture de la frontière Bénin–Niger.</w:t>
+      </w:r>
+      <w:r>
+        <w:t xml:space="preserve"> Si elle intervient avant</w:t>
+      </w:r>
+    </w:p>
+    <w:p>
+      <w:r>
+        <w:t>l'expédition, basculer sur le corridor de Cotonou (cellule B3 du classeur) : environ 790 000 FCFA d'économie sur le conteneur et 10 jours de gagnés.</w:t>
+      </w:r>
+    </w:p>
+    <w:p>
+      <w:pPr>
         <w:jc w:val="center"/>
       </w:pPr>
       <w:r>
@@ -2956,6 +3543,434 @@
           <w:color w:val="999999"/>
         </w:rPr>
         <w:t>____________________________________________________________</w:t>
+      </w:r>
+    </w:p>
+    <w:p>
+      <w:pPr>
+        <w:pStyle w:val="Heading2"/>
+      </w:pPr>
+      <w:r/>
+      <w:r>
+        <w:t>NIVEAU DE FIABILITÉ DES DONNÉES</w:t>
+      </w:r>
+    </w:p>
+    <w:tbl>
+      <w:tblPr>
+        <w:tblStyle w:val="TableGrid"/>
+        <w:tblW w:type="auto" w:w="0"/>
+        <w:tblLook w:firstColumn="1" w:firstRow="1" w:lastColumn="0" w:lastRow="0" w:noHBand="0" w:noVBand="1" w:val="04A0"/>
+      </w:tblPr>
+      <w:tblGrid>
+        <w:gridCol w:w="3249"/>
+        <w:gridCol w:w="3249"/>
+        <w:gridCol w:w="3249"/>
+      </w:tblGrid>
+      <w:tr>
+        <w:tc>
+          <w:tcPr>
+            <w:tcW w:type="dxa" w:w="3249"/>
+          </w:tcPr>
+          <w:p>
+            <w:r>
+              <w:rPr>
+                <w:b/>
+              </w:rPr>
+            </w:r>
+            <w:r>
+              <w:rPr>
+                <w:b/>
+              </w:rPr>
+              <w:t>Donnée</w:t>
+            </w:r>
+          </w:p>
+        </w:tc>
+        <w:tc>
+          <w:tcPr>
+            <w:tcW w:type="dxa" w:w="3249"/>
+          </w:tcPr>
+          <w:p>
+            <w:r>
+              <w:rPr>
+                <w:b/>
+              </w:rPr>
+            </w:r>
+            <w:r>
+              <w:rPr>
+                <w:b/>
+              </w:rPr>
+              <w:t>Statut</w:t>
+            </w:r>
+          </w:p>
+        </w:tc>
+        <w:tc>
+          <w:tcPr>
+            <w:tcW w:type="dxa" w:w="3249"/>
+          </w:tcPr>
+          <w:p>
+            <w:r>
+              <w:rPr>
+                <w:b/>
+              </w:rPr>
+            </w:r>
+            <w:r>
+              <w:rPr>
+                <w:b/>
+              </w:rPr>
+              <w:t>Source</w:t>
+            </w:r>
+          </w:p>
+        </w:tc>
+      </w:tr>
+      <w:tr>
+        <w:tc>
+          <w:tcPr>
+            <w:tcW w:type="dxa" w:w="3249"/>
+          </w:tcPr>
+          <w:p>
+            <w:r/>
+            <w:r>
+              <w:t>Prix FOB, poids, dimensions, photos</w:t>
+            </w:r>
+          </w:p>
+        </w:tc>
+        <w:tc>
+          <w:tcPr>
+            <w:tcW w:type="dxa" w:w="3249"/>
+          </w:tcPr>
+          <w:p>
+            <w:r/>
+            <w:r>
+              <w:t xml:space="preserve">✅ </w:t>
+            </w:r>
+            <w:r>
+              <w:rPr>
+                <w:b/>
+              </w:rPr>
+              <w:t>Ferme</w:t>
+            </w:r>
+          </w:p>
+        </w:tc>
+        <w:tc>
+          <w:tcPr>
+            <w:tcW w:type="dxa" w:w="3249"/>
+          </w:tcPr>
+          <w:p>
+            <w:r/>
+            <w:r>
+              <w:t>Cotation ZENO du 19/08/2026</w:t>
+            </w:r>
+          </w:p>
+        </w:tc>
+      </w:tr>
+      <w:tr>
+        <w:tc>
+          <w:tcPr>
+            <w:tcW w:type="dxa" w:w="3249"/>
+          </w:tcPr>
+          <w:p>
+            <w:r/>
+            <w:r>
+              <w:t>Taux de change USD/XOF</w:t>
+            </w:r>
+          </w:p>
+        </w:tc>
+        <w:tc>
+          <w:tcPr>
+            <w:tcW w:type="dxa" w:w="3249"/>
+          </w:tcPr>
+          <w:p>
+            <w:r/>
+            <w:r>
+              <w:t>✅ Vérifié</w:t>
+            </w:r>
+          </w:p>
+        </w:tc>
+        <w:tc>
+          <w:tcPr>
+            <w:tcW w:type="dxa" w:w="3249"/>
+          </w:tcPr>
+          <w:p>
+            <w:r/>
+            <w:r>
+              <w:t>Moyenne 2026 : 559 F ; 560 F retenus</w:t>
+            </w:r>
+          </w:p>
+        </w:tc>
+      </w:tr>
+      <w:tr>
+        <w:tc>
+          <w:tcPr>
+            <w:tcW w:type="dxa" w:w="3249"/>
+          </w:tcPr>
+          <w:p>
+            <w:r/>
+            <w:r>
+              <w:t>État de la frontière Bénin–Niger</w:t>
+            </w:r>
+          </w:p>
+        </w:tc>
+        <w:tc>
+          <w:tcPr>
+            <w:tcW w:type="dxa" w:w="3249"/>
+          </w:tcPr>
+          <w:p>
+            <w:r/>
+            <w:r>
+              <w:t>✅ Vérifié</w:t>
+            </w:r>
+          </w:p>
+        </w:tc>
+        <w:tc>
+          <w:tcPr>
+            <w:tcW w:type="dxa" w:w="3249"/>
+          </w:tcPr>
+          <w:p>
+            <w:r/>
+            <w:r>
+              <w:t>Presse régionale, août 2026</w:t>
+            </w:r>
+          </w:p>
+        </w:tc>
+      </w:tr>
+      <w:tr>
+        <w:tc>
+          <w:tcPr>
+            <w:tcW w:type="dxa" w:w="3249"/>
+          </w:tcPr>
+          <w:p>
+            <w:r/>
+            <w:r>
+              <w:t>Fret maritime Chine → Afrique de l'Ouest</w:t>
+            </w:r>
+          </w:p>
+        </w:tc>
+        <w:tc>
+          <w:tcPr>
+            <w:tcW w:type="dxa" w:w="3249"/>
+          </w:tcPr>
+          <w:p>
+            <w:r/>
+            <w:r>
+              <w:t xml:space="preserve">🟠 </w:t>
+            </w:r>
+            <w:r>
+              <w:rPr>
+                <w:b/>
+              </w:rPr>
+              <w:t>Fourchette de marché</w:t>
+            </w:r>
+          </w:p>
+        </w:tc>
+        <w:tc>
+          <w:tcPr>
+            <w:tcW w:type="dxa" w:w="3249"/>
+          </w:tcPr>
+          <w:p>
+            <w:r/>
+            <w:r>
+              <w:t>1 350 – 1 950 USD/20' ; à faire coter</w:t>
+            </w:r>
+          </w:p>
+        </w:tc>
+      </w:tr>
+      <w:tr>
+        <w:tc>
+          <w:tcPr>
+            <w:tcW w:type="dxa" w:w="3249"/>
+          </w:tcPr>
+          <w:p>
+            <w:r/>
+            <w:r>
+              <w:t>Frais portuaires et transit</w:t>
+            </w:r>
+          </w:p>
+        </w:tc>
+        <w:tc>
+          <w:tcPr>
+            <w:tcW w:type="dxa" w:w="3249"/>
+          </w:tcPr>
+          <w:p>
+            <w:r/>
+            <w:r>
+              <w:t>🟠 Fourchette de marché</w:t>
+            </w:r>
+          </w:p>
+        </w:tc>
+        <w:tc>
+          <w:tcPr>
+            <w:tcW w:type="dxa" w:w="3249"/>
+          </w:tcPr>
+          <w:p>
+            <w:r/>
+            <w:r>
+              <w:t>200 000 – 500 000 F ; à faire coter</w:t>
+            </w:r>
+          </w:p>
+        </w:tc>
+      </w:tr>
+      <w:tr>
+        <w:tc>
+          <w:tcPr>
+            <w:tcW w:type="dxa" w:w="3249"/>
+          </w:tcPr>
+          <w:p>
+            <w:r/>
+            <w:r>
+              <w:t>Transport routier port → Niamey</w:t>
+            </w:r>
+          </w:p>
+        </w:tc>
+        <w:tc>
+          <w:tcPr>
+            <w:tcW w:type="dxa" w:w="3249"/>
+          </w:tcPr>
+          <w:p>
+            <w:r/>
+            <w:r>
+              <w:t>🟠 Fourchette de marché</w:t>
+            </w:r>
+          </w:p>
+        </w:tc>
+        <w:tc>
+          <w:tcPr>
+            <w:tcW w:type="dxa" w:w="3249"/>
+          </w:tcPr>
+          <w:p>
+            <w:r/>
+            <w:r>
+              <w:t>800 000 – 1 500 000 F en direct ; à faire coter</w:t>
+            </w:r>
+          </w:p>
+        </w:tc>
+      </w:tr>
+      <w:tr>
+        <w:tc>
+          <w:tcPr>
+            <w:tcW w:type="dxa" w:w="3249"/>
+          </w:tcPr>
+          <w:p>
+            <w:r/>
+            <w:r>
+              <w:t>Taux de droit de douane (5 %, catégorie 1)</w:t>
+            </w:r>
+          </w:p>
+        </w:tc>
+        <w:tc>
+          <w:tcPr>
+            <w:tcW w:type="dxa" w:w="3249"/>
+          </w:tcPr>
+          <w:p>
+            <w:r/>
+            <w:r>
+              <w:t xml:space="preserve">🔴 </w:t>
+            </w:r>
+            <w:r>
+              <w:rPr>
+                <w:b/>
+              </w:rPr>
+              <w:t>À CONFIRMER</w:t>
+            </w:r>
+          </w:p>
+        </w:tc>
+        <w:tc>
+          <w:tcPr>
+            <w:tcW w:type="dxa" w:w="3249"/>
+          </w:tcPr>
+          <w:p>
+            <w:r/>
+            <w:r>
+              <w:t>TEC UEMOA/CEDEAO — classement SH à valider</w:t>
+            </w:r>
+          </w:p>
+        </w:tc>
+      </w:tr>
+      <w:tr>
+        <w:tc>
+          <w:tcPr>
+            <w:tcW w:type="dxa" w:w="3249"/>
+          </w:tcPr>
+          <w:p>
+            <w:r/>
+            <w:r>
+              <w:t>RS 1 %, PCS 0,8 %, PC 0,5 %, TVA 19 %, ISB 2 %</w:t>
+            </w:r>
+          </w:p>
+        </w:tc>
+        <w:tc>
+          <w:tcPr>
+            <w:tcW w:type="dxa" w:w="3249"/>
+          </w:tcPr>
+          <w:p>
+            <w:r/>
+            <w:r>
+              <w:t>🟠 Taux usuels</w:t>
+            </w:r>
+          </w:p>
+        </w:tc>
+        <w:tc>
+          <w:tcPr>
+            <w:tcW w:type="dxa" w:w="3249"/>
+          </w:tcPr>
+          <w:p>
+            <w:r/>
+            <w:r>
+              <w:t>À confirmer par le transitaire</w:t>
+            </w:r>
+          </w:p>
+        </w:tc>
+      </w:tr>
+      <w:tr>
+        <w:tc>
+          <w:tcPr>
+            <w:tcW w:type="dxa" w:w="3249"/>
+          </w:tcPr>
+          <w:p>
+            <w:r/>
+            <w:r>
+              <w:t>Prix de marché à Niamey</w:t>
+            </w:r>
+          </w:p>
+        </w:tc>
+        <w:tc>
+          <w:tcPr>
+            <w:tcW w:type="dxa" w:w="3249"/>
+          </w:tcPr>
+          <w:p>
+            <w:r/>
+            <w:r>
+              <w:t xml:space="preserve">🔴 </w:t>
+            </w:r>
+            <w:r>
+              <w:rPr>
+                <w:b/>
+              </w:rPr>
+              <w:t>À RELEVER</w:t>
+            </w:r>
+          </w:p>
+        </w:tc>
+        <w:tc>
+          <w:tcPr>
+            <w:tcW w:type="dxa" w:w="3249"/>
+          </w:tcPr>
+          <w:p>
+            <w:r/>
+            <w:r>
+              <w:t>Repères tirés de distributeurs ouest-africains</w:t>
+            </w:r>
+          </w:p>
+        </w:tc>
+      </w:tr>
+    </w:tbl>
+    <w:p/>
+    <w:p>
+      <w:r>
+        <w:rPr>
+          <w:b/>
+        </w:rPr>
+        <w:t>Aucun de ces coûts logistiques n'est une cotation ferme.</w:t>
+      </w:r>
+      <w:r>
+        <w:t xml:space="preserve"> Ils encadrent correctement le prix de revient, mais une cotation du transitaire (fret + port + route + dédouanement) et la confirmation du classement douanier sont indispensables avant d'engager la commande. Les quatre paramètres concernés sont regroupés dans l'onglet « Corridors » et se modifient en une saisie.</w:t>
       </w:r>
     </w:p>
     <w:p>
@@ -2997,7 +4012,20 @@
         <w:pStyle w:val="ListBullet"/>
       </w:pPr>
       <w:r>
-        <w:t>Fret maritime Chine → Lomé : fourchette de marché 1 350 – 1 950 USD par conteneur 20'.</w:t>
+        <w:t>Fret maritime Chine → Afrique de l'Ouest : fourchette de marché 1 350 – 1 950 USD par 20'.</w:t>
+      </w:r>
+    </w:p>
+    <w:p>
+      <w:pPr>
+        <w:pStyle w:val="ListBullet"/>
+      </w:pPr>
+      <w:r>
+        <w:t>Acheminement Chine → Niamey via Cotonou, tout compris : 4 000 – 4 700 USD par 20' (source</w:t>
+      </w:r>
+    </w:p>
+    <w:p>
+      <w:r>
+        <w:t>transitaire) ; transit terrestre port → Niamey 800 000 – 1 500 000 FCFA ; frais portuaires 200 000 – 500 000 FCFA.</w:t>
       </w:r>
     </w:p>
     <w:p>
@@ -3013,7 +4041,20 @@
         <w:pStyle w:val="ListBullet"/>
       </w:pPr>
       <w:r>
-        <w:t>Fiscalité : TEC UEMOA/CEDEAO — catégorie 1 (biens d'équipement) à 5 %, RS 1 %, PCS 1 %,</w:t>
+        <w:t>Frontière Bénin–Niger fermée depuis juillet 2023, non rouverte en août 2026 ; corridor</w:t>
+      </w:r>
+    </w:p>
+    <w:p>
+      <w:r>
+        <w:t>Tsamiya–Kamba (via Nigeria) rouvert le 9 février 2026.</w:t>
+      </w:r>
+    </w:p>
+    <w:p>
+      <w:pPr>
+        <w:pStyle w:val="ListBullet"/>
+      </w:pPr>
+      <w:r>
+        <w:t>Fiscalité : TEC UEMOA/CEDEAO — catégorie 1 (biens d'équipement) à 5 %, RS 1 %, PCS 0,8 %,</w:t>
       </w:r>
     </w:p>
     <w:p>

</xml_diff>